<commit_message>
Update translator search table
</commit_message>
<xml_diff>
--- a/translator_searches.docx
+++ b/translator_searches.docx
@@ -61,7 +61,7 @@
                 <w:rFonts w:ascii="Calibri" w:hAnsi="Calibri"/>
                 <w:sz w:val="20"/>
               </w:rPr>
-              <w:t xml:space="preserve">Source</w:t>
+              <w:t xml:space="preserve">Supporting evidence</w:t>
             </w:r>
           </w:p>
         </w:tc>
@@ -70,6 +70,7 @@
             <w:tcBorders>
               <w:top w:val="single" w:sz="16" w:space="0" w:color="D3D3D3"/>
               <w:bottom w:val="single" w:sz="16" w:space="0" w:color="D3D3D3"/>
+              <w:end w:val="single" w:space="0" w:color="D3D3D3"/>
             </w:tcBorders>
           </w:tcPr>
           <w:p>
@@ -84,31 +85,7 @@
                 <w:rFonts w:ascii="Calibri" w:hAnsi="Calibri"/>
                 <w:sz w:val="20"/>
               </w:rPr>
-              <w:t xml:space="preserve">Query</w:t>
-            </w:r>
-          </w:p>
-        </w:tc>
-        <w:tc>
-          <w:tcPr>
-            <w:tcBorders>
-              <w:top w:val="single" w:sz="16" w:space="0" w:color="D3D3D3"/>
-              <w:bottom w:val="single" w:sz="16" w:space="0" w:color="D3D3D3"/>
-              <w:end w:val="single" w:space="0" w:color="D3D3D3"/>
-            </w:tcBorders>
-          </w:tcPr>
-          <w:p>
-            <w:pPr>
-              <w:spacing w:before="0" w:after="60"/>
-              <w:keepNext/>
-              <w:jc w:val="center"/>
-            </w:pPr>
-            <w:r>
-              <w:rPr>
-                <w:b w:val="true"/>
-                <w:rFonts w:ascii="Calibri" w:hAnsi="Calibri"/>
-                <w:sz w:val="20"/>
-              </w:rPr>
-              <w:t xml:space="preserve">Hits</w:t>
+              <w:t xml:space="preserve">Translator results</w:t>
             </w:r>
           </w:p>
         </w:tc>
@@ -128,7 +105,7 @@
             <w:tcMar>
               <w:top w:w="25" w:type="dxa"/>
             </w:tcMar>
-            <w:gridSpan w:val="4"/>
+            <w:gridSpan w:val="3"/>
           </w:tcPr>
           <w:p>
             <w:pPr>
@@ -222,31 +199,6 @@
                 <w:rFonts w:ascii="Calibri" w:hAnsi="Calibri"/>
                 <w:sz w:val="20"/>
               </w:rPr>
-              <w:t xml:space="preserve">What drugs may impact conditions related to intellectual disability</w:t>
-            </w:r>
-          </w:p>
-        </w:tc>
-        <w:tc>
-          <w:tcPr>
-            <w:tcBorders>
-              <w:top w:val="single" w:space="0" w:color="D3D3D3"/>
-              <w:bottom w:val="single" w:space="0" w:color="D3D3D3"/>
-              <w:start w:val="single" w:space="0" w:color="D3D3D3"/>
-              <w:end w:val="single" w:space="0" w:color="D3D3D3"/>
-            </w:tcBorders>
-            <w:shd w:val="clear" w:color="auto" w:fill="F2F2F2"/>
-          </w:tcPr>
-          <w:p>
-            <w:pPr>
-              <w:spacing w:before="0" w:after="60"/>
-              <w:keepNext/>
-              <w:jc w:val="center"/>
-            </w:pPr>
-            <w:r>
-              <w:rPr>
-                <w:rFonts w:ascii="Calibri" w:hAnsi="Calibri"/>
-                <w:sz w:val="20"/>
-              </w:rPr>
               <w:t xml:space="preserve">546</w:t>
             </w:r>
           </w:p>
@@ -326,30 +278,6 @@
                 <w:rFonts w:ascii="Calibri" w:hAnsi="Calibri"/>
                 <w:sz w:val="20"/>
               </w:rPr>
-              <w:t xml:space="preserve">What drugs may impact conditions related to cerebral atrophy</w:t>
-            </w:r>
-          </w:p>
-        </w:tc>
-        <w:tc>
-          <w:tcPr>
-            <w:tcBorders>
-              <w:top w:val="single" w:space="0" w:color="D3D3D3"/>
-              <w:bottom w:val="single" w:space="0" w:color="D3D3D3"/>
-              <w:start w:val="single" w:space="0" w:color="D3D3D3"/>
-              <w:end w:val="single" w:space="0" w:color="D3D3D3"/>
-            </w:tcBorders>
-          </w:tcPr>
-          <w:p>
-            <w:pPr>
-              <w:spacing w:before="0" w:after="60"/>
-              <w:keepNext/>
-              <w:jc w:val="center"/>
-            </w:pPr>
-            <w:r>
-              <w:rPr>
-                <w:rFonts w:ascii="Calibri" w:hAnsi="Calibri"/>
-                <w:sz w:val="20"/>
-              </w:rPr>
               <w:t xml:space="preserve">127</w:t>
             </w:r>
           </w:p>
@@ -431,31 +359,6 @@
                 <w:rFonts w:ascii="Calibri" w:hAnsi="Calibri"/>
                 <w:sz w:val="20"/>
               </w:rPr>
-              <w:t xml:space="preserve">What drugs may impact conditions related to hypoplasia of the corpus callosum</w:t>
-            </w:r>
-          </w:p>
-        </w:tc>
-        <w:tc>
-          <w:tcPr>
-            <w:tcBorders>
-              <w:top w:val="single" w:space="0" w:color="D3D3D3"/>
-              <w:bottom w:val="single" w:space="0" w:color="D3D3D3"/>
-              <w:start w:val="single" w:space="0" w:color="D3D3D3"/>
-              <w:end w:val="single" w:space="0" w:color="D3D3D3"/>
-            </w:tcBorders>
-            <w:shd w:val="clear" w:color="auto" w:fill="F2F2F2"/>
-          </w:tcPr>
-          <w:p>
-            <w:pPr>
-              <w:spacing w:before="0" w:after="60"/>
-              <w:keepNext/>
-              <w:jc w:val="center"/>
-            </w:pPr>
-            <w:r>
-              <w:rPr>
-                <w:rFonts w:ascii="Calibri" w:hAnsi="Calibri"/>
-                <w:sz w:val="20"/>
-              </w:rPr>
               <w:t xml:space="preserve">124</w:t>
             </w:r>
           </w:p>
@@ -535,30 +438,6 @@
                 <w:rFonts w:ascii="Calibri" w:hAnsi="Calibri"/>
                 <w:sz w:val="20"/>
               </w:rPr>
-              <w:t xml:space="preserve">What drugs may impact conditions related to delayed myelination</w:t>
-            </w:r>
-          </w:p>
-        </w:tc>
-        <w:tc>
-          <w:tcPr>
-            <w:tcBorders>
-              <w:top w:val="single" w:space="0" w:color="D3D3D3"/>
-              <w:bottom w:val="single" w:space="0" w:color="D3D3D3"/>
-              <w:start w:val="single" w:space="0" w:color="D3D3D3"/>
-              <w:end w:val="single" w:space="0" w:color="D3D3D3"/>
-            </w:tcBorders>
-          </w:tcPr>
-          <w:p>
-            <w:pPr>
-              <w:spacing w:before="0" w:after="60"/>
-              <w:keepNext/>
-              <w:jc w:val="center"/>
-            </w:pPr>
-            <w:r>
-              <w:rPr>
-                <w:rFonts w:ascii="Calibri" w:hAnsi="Calibri"/>
-                <w:sz w:val="20"/>
-              </w:rPr>
               <w:t xml:space="preserve">104</w:t>
             </w:r>
           </w:p>
@@ -640,31 +519,6 @@
                 <w:rFonts w:ascii="Calibri" w:hAnsi="Calibri"/>
                 <w:sz w:val="20"/>
               </w:rPr>
-              <w:t xml:space="preserve">What drugs may impact conditions related to spastic diplegia</w:t>
-            </w:r>
-          </w:p>
-        </w:tc>
-        <w:tc>
-          <w:tcPr>
-            <w:tcBorders>
-              <w:top w:val="single" w:space="0" w:color="D3D3D3"/>
-              <w:bottom w:val="single" w:space="0" w:color="D3D3D3"/>
-              <w:start w:val="single" w:space="0" w:color="D3D3D3"/>
-              <w:end w:val="single" w:space="0" w:color="D3D3D3"/>
-            </w:tcBorders>
-            <w:shd w:val="clear" w:color="auto" w:fill="F2F2F2"/>
-          </w:tcPr>
-          <w:p>
-            <w:pPr>
-              <w:spacing w:before="0" w:after="60"/>
-              <w:keepNext/>
-              <w:jc w:val="center"/>
-            </w:pPr>
-            <w:r>
-              <w:rPr>
-                <w:rFonts w:ascii="Calibri" w:hAnsi="Calibri"/>
-                <w:sz w:val="20"/>
-              </w:rPr>
               <w:t xml:space="preserve">444</w:t>
             </w:r>
           </w:p>
@@ -744,30 +598,6 @@
                 <w:rFonts w:ascii="Calibri" w:hAnsi="Calibri"/>
                 <w:sz w:val="20"/>
               </w:rPr>
-              <w:t xml:space="preserve">What drugs may impact conditions related to hypotonia</w:t>
-            </w:r>
-          </w:p>
-        </w:tc>
-        <w:tc>
-          <w:tcPr>
-            <w:tcBorders>
-              <w:top w:val="single" w:space="0" w:color="D3D3D3"/>
-              <w:bottom w:val="single" w:space="0" w:color="D3D3D3"/>
-              <w:start w:val="single" w:space="0" w:color="D3D3D3"/>
-              <w:end w:val="single" w:space="0" w:color="D3D3D3"/>
-            </w:tcBorders>
-          </w:tcPr>
-          <w:p>
-            <w:pPr>
-              <w:spacing w:before="0" w:after="60"/>
-              <w:keepNext/>
-              <w:jc w:val="center"/>
-            </w:pPr>
-            <w:r>
-              <w:rPr>
-                <w:rFonts w:ascii="Calibri" w:hAnsi="Calibri"/>
-                <w:sz w:val="20"/>
-              </w:rPr>
               <w:t xml:space="preserve">30</w:t>
             </w:r>
           </w:p>
@@ -849,31 +679,6 @@
                 <w:rFonts w:ascii="Calibri" w:hAnsi="Calibri"/>
                 <w:sz w:val="20"/>
               </w:rPr>
-              <w:t xml:space="preserve">What drugs may impact conditions related to autism</w:t>
-            </w:r>
-          </w:p>
-        </w:tc>
-        <w:tc>
-          <w:tcPr>
-            <w:tcBorders>
-              <w:top w:val="single" w:space="0" w:color="D3D3D3"/>
-              <w:bottom w:val="single" w:space="0" w:color="D3D3D3"/>
-              <w:start w:val="single" w:space="0" w:color="D3D3D3"/>
-              <w:end w:val="single" w:space="0" w:color="D3D3D3"/>
-            </w:tcBorders>
-            <w:shd w:val="clear" w:color="auto" w:fill="F2F2F2"/>
-          </w:tcPr>
-          <w:p>
-            <w:pPr>
-              <w:spacing w:before="0" w:after="60"/>
-              <w:keepNext/>
-              <w:jc w:val="center"/>
-            </w:pPr>
-            <w:r>
-              <w:rPr>
-                <w:rFonts w:ascii="Calibri" w:hAnsi="Calibri"/>
-                <w:sz w:val="20"/>
-              </w:rPr>
               <w:t xml:space="preserve">700</w:t>
             </w:r>
           </w:p>
@@ -929,31 +734,7 @@
                 <w:rFonts w:ascii="Calibri" w:hAnsi="Calibri"/>
                 <w:sz w:val="20"/>
               </w:rPr>
-              <w:t xml:space="default"/>
-            </w:r>
-          </w:p>
-        </w:tc>
-        <w:tc>
-          <w:tcPr>
-            <w:tcBorders>
-              <w:top w:val="single" w:space="0" w:color="D3D3D3"/>
-              <w:bottom w:val="single" w:space="0" w:color="D3D3D3"/>
-              <w:start w:val="single" w:space="0" w:color="D3D3D3"/>
-              <w:end w:val="single" w:space="0" w:color="D3D3D3"/>
-            </w:tcBorders>
-          </w:tcPr>
-          <w:p>
-            <w:pPr>
-              <w:spacing w:before="0" w:after="60"/>
-              <w:keepNext/>
-              <w:jc w:val="center"/>
-            </w:pPr>
-            <w:r>
-              <w:rPr>
-                <w:rFonts w:ascii="Calibri" w:hAnsi="Calibri"/>
-                <w:sz w:val="20"/>
-              </w:rPr>
-              <w:t xml:space="preserve">What drugs may impact conditions related to movement disorder</w:t>
+              <w:t xml:space="preserve">Zhang 2025</w:t>
             </w:r>
           </w:p>
         </w:tc>
@@ -1058,31 +839,6 @@
                 <w:rFonts w:ascii="Calibri" w:hAnsi="Calibri"/>
                 <w:sz w:val="20"/>
               </w:rPr>
-              <w:t xml:space="preserve">What drugs may impact conditions related to cerebellar ataxia</w:t>
-            </w:r>
-          </w:p>
-        </w:tc>
-        <w:tc>
-          <w:tcPr>
-            <w:tcBorders>
-              <w:top w:val="single" w:space="0" w:color="D3D3D3"/>
-              <w:bottom w:val="single" w:space="0" w:color="D3D3D3"/>
-              <w:start w:val="single" w:space="0" w:color="D3D3D3"/>
-              <w:end w:val="single" w:space="0" w:color="D3D3D3"/>
-            </w:tcBorders>
-            <w:shd w:val="clear" w:color="auto" w:fill="F2F2F2"/>
-          </w:tcPr>
-          <w:p>
-            <w:pPr>
-              <w:spacing w:before="0" w:after="60"/>
-              <w:keepNext/>
-              <w:jc w:val="center"/>
-            </w:pPr>
-            <w:r>
-              <w:rPr>
-                <w:rFonts w:ascii="Calibri" w:hAnsi="Calibri"/>
-                <w:sz w:val="20"/>
-              </w:rPr>
               <w:t xml:space="preserve">693</w:t>
             </w:r>
           </w:p>
@@ -1162,30 +918,6 @@
                 <w:rFonts w:ascii="Calibri" w:hAnsi="Calibri"/>
                 <w:sz w:val="20"/>
               </w:rPr>
-              <w:t xml:space="preserve">What drugs may impact conditions related to unsteady gait</w:t>
-            </w:r>
-          </w:p>
-        </w:tc>
-        <w:tc>
-          <w:tcPr>
-            <w:tcBorders>
-              <w:top w:val="single" w:space="0" w:color="D3D3D3"/>
-              <w:bottom w:val="single" w:space="0" w:color="D3D3D3"/>
-              <w:start w:val="single" w:space="0" w:color="D3D3D3"/>
-              <w:end w:val="single" w:space="0" w:color="D3D3D3"/>
-            </w:tcBorders>
-          </w:tcPr>
-          <w:p>
-            <w:pPr>
-              <w:spacing w:before="0" w:after="60"/>
-              <w:keepNext/>
-              <w:jc w:val="center"/>
-            </w:pPr>
-            <w:r>
-              <w:rPr>
-                <w:rFonts w:ascii="Calibri" w:hAnsi="Calibri"/>
-                <w:sz w:val="20"/>
-              </w:rPr>
               <w:t xml:space="preserve">121</w:t>
             </w:r>
           </w:p>
@@ -1267,31 +999,6 @@
                 <w:rFonts w:ascii="Calibri" w:hAnsi="Calibri"/>
                 <w:sz w:val="20"/>
               </w:rPr>
-              <w:t xml:space="preserve">What drugs may impact conditions related to spasticity</w:t>
-            </w:r>
-          </w:p>
-        </w:tc>
-        <w:tc>
-          <w:tcPr>
-            <w:tcBorders>
-              <w:top w:val="single" w:space="0" w:color="D3D3D3"/>
-              <w:bottom w:val="single" w:space="0" w:color="D3D3D3"/>
-              <w:start w:val="single" w:space="0" w:color="D3D3D3"/>
-              <w:end w:val="single" w:space="0" w:color="D3D3D3"/>
-            </w:tcBorders>
-            <w:shd w:val="clear" w:color="auto" w:fill="F2F2F2"/>
-          </w:tcPr>
-          <w:p>
-            <w:pPr>
-              <w:spacing w:before="0" w:after="60"/>
-              <w:keepNext/>
-              <w:jc w:val="center"/>
-            </w:pPr>
-            <w:r>
-              <w:rPr>
-                <w:rFonts w:ascii="Calibri" w:hAnsi="Calibri"/>
-                <w:sz w:val="20"/>
-              </w:rPr>
               <w:t xml:space="preserve">174</w:t>
             </w:r>
           </w:p>
@@ -1347,31 +1054,7 @@
                 <w:rFonts w:ascii="Calibri" w:hAnsi="Calibri"/>
                 <w:sz w:val="20"/>
               </w:rPr>
-              <w:t xml:space="default"/>
-            </w:r>
-          </w:p>
-        </w:tc>
-        <w:tc>
-          <w:tcPr>
-            <w:tcBorders>
-              <w:top w:val="single" w:space="0" w:color="D3D3D3"/>
-              <w:bottom w:val="single" w:space="0" w:color="D3D3D3"/>
-              <w:start w:val="single" w:space="0" w:color="D3D3D3"/>
-              <w:end w:val="single" w:space="0" w:color="D3D3D3"/>
-            </w:tcBorders>
-          </w:tcPr>
-          <w:p>
-            <w:pPr>
-              <w:spacing w:before="0" w:after="60"/>
-              <w:keepNext/>
-              <w:jc w:val="center"/>
-            </w:pPr>
-            <w:r>
-              <w:rPr>
-                <w:rFonts w:ascii="Calibri" w:hAnsi="Calibri"/>
-                <w:sz w:val="20"/>
-              </w:rPr>
-              <w:t xml:space="preserve">What drugs may impact conditions related to generalized dystonia</w:t>
+              <w:t xml:space="preserve">Zhang 2025</w:t>
             </w:r>
           </w:p>
         </w:tc>
@@ -1476,31 +1159,6 @@
                 <w:rFonts w:ascii="Calibri" w:hAnsi="Calibri"/>
                 <w:sz w:val="20"/>
               </w:rPr>
-              <w:t xml:space="preserve">What drugs may impact conditions related to muscle stiffness</w:t>
-            </w:r>
-          </w:p>
-        </w:tc>
-        <w:tc>
-          <w:tcPr>
-            <w:tcBorders>
-              <w:top w:val="single" w:space="0" w:color="D3D3D3"/>
-              <w:bottom w:val="single" w:space="0" w:color="D3D3D3"/>
-              <w:start w:val="single" w:space="0" w:color="D3D3D3"/>
-              <w:end w:val="single" w:space="0" w:color="D3D3D3"/>
-            </w:tcBorders>
-            <w:shd w:val="clear" w:color="auto" w:fill="F2F2F2"/>
-          </w:tcPr>
-          <w:p>
-            <w:pPr>
-              <w:spacing w:before="0" w:after="60"/>
-              <w:keepNext/>
-              <w:jc w:val="center"/>
-            </w:pPr>
-            <w:r>
-              <w:rPr>
-                <w:rFonts w:ascii="Calibri" w:hAnsi="Calibri"/>
-                <w:sz w:val="20"/>
-              </w:rPr>
               <w:t xml:space="preserve">47</w:t>
             </w:r>
           </w:p>
@@ -1521,7 +1179,7 @@
             <w:tcMar>
               <w:top w:w="25" w:type="dxa"/>
             </w:tcMar>
-            <w:gridSpan w:val="4"/>
+            <w:gridSpan w:val="3"/>
           </w:tcPr>
           <w:p>
             <w:pPr>
@@ -1589,31 +1247,7 @@
                 <w:rFonts w:ascii="Calibri" w:hAnsi="Calibri"/>
                 <w:sz w:val="20"/>
               </w:rPr>
-              <w:t xml:space="default"/>
-            </w:r>
-          </w:p>
-        </w:tc>
-        <w:tc>
-          <w:tcPr>
-            <w:tcBorders>
-              <w:top w:val="single" w:space="0" w:color="D3D3D3"/>
-              <w:bottom w:val="single" w:space="0" w:color="D3D3D3"/>
-              <w:start w:val="single" w:space="0" w:color="D3D3D3"/>
-              <w:end w:val="single" w:space="0" w:color="D3D3D3"/>
-            </w:tcBorders>
-          </w:tcPr>
-          <w:p>
-            <w:pPr>
-              <w:spacing w:before="0" w:after="60"/>
-              <w:keepNext/>
-              <w:jc w:val="center"/>
-            </w:pPr>
-            <w:r>
-              <w:rPr>
-                <w:rFonts w:ascii="Calibri" w:hAnsi="Calibri"/>
-                <w:sz w:val="20"/>
-              </w:rPr>
-              <w:t xml:space="preserve">What drugs may impact conditions related to neuroinflammation</w:t>
+              <w:t xml:space="preserve">Yang 2016</w:t>
             </w:r>
           </w:p>
         </w:tc>
@@ -1693,32 +1327,7 @@
                 <w:rFonts w:ascii="Calibri" w:hAnsi="Calibri"/>
                 <w:sz w:val="20"/>
               </w:rPr>
-              <w:t xml:space="default"/>
-            </w:r>
-          </w:p>
-        </w:tc>
-        <w:tc>
-          <w:tcPr>
-            <w:tcBorders>
-              <w:top w:val="single" w:space="0" w:color="D3D3D3"/>
-              <w:bottom w:val="single" w:space="0" w:color="D3D3D3"/>
-              <w:start w:val="single" w:space="0" w:color="D3D3D3"/>
-              <w:end w:val="single" w:space="0" w:color="D3D3D3"/>
-            </w:tcBorders>
-            <w:shd w:val="clear" w:color="auto" w:fill="F2F2F2"/>
-          </w:tcPr>
-          <w:p>
-            <w:pPr>
-              <w:spacing w:before="0" w:after="60"/>
-              <w:keepNext/>
-              <w:jc w:val="center"/>
-            </w:pPr>
-            <w:r>
-              <w:rPr>
-                <w:rFonts w:ascii="Calibri" w:hAnsi="Calibri"/>
-                <w:sz w:val="20"/>
-              </w:rPr>
-              <w:t xml:space="preserve">What drugs may impact conditions related to increased reactive oxygen species production</w:t>
+              <w:t xml:space="preserve">Matsuura 2002</w:t>
             </w:r>
           </w:p>
         </w:tc>
@@ -1798,31 +1407,7 @@
                 <w:rFonts w:ascii="Calibri" w:hAnsi="Calibri"/>
                 <w:sz w:val="20"/>
               </w:rPr>
-              <w:t xml:space="default"/>
-            </w:r>
-          </w:p>
-        </w:tc>
-        <w:tc>
-          <w:tcPr>
-            <w:tcBorders>
-              <w:top w:val="single" w:space="0" w:color="D3D3D3"/>
-              <w:bottom w:val="single" w:space="0" w:color="D3D3D3"/>
-              <w:start w:val="single" w:space="0" w:color="D3D3D3"/>
-              <w:end w:val="single" w:space="0" w:color="D3D3D3"/>
-            </w:tcBorders>
-          </w:tcPr>
-          <w:p>
-            <w:pPr>
-              <w:spacing w:before="0" w:after="60"/>
-              <w:keepNext/>
-              <w:jc w:val="center"/>
-            </w:pPr>
-            <w:r>
-              <w:rPr>
-                <w:rFonts w:ascii="Calibri" w:hAnsi="Calibri"/>
-                <w:sz w:val="20"/>
-              </w:rPr>
-              <w:t xml:space="preserve">What drugs may impact conditions related to neurodevelopmental disorder</w:t>
+              <w:t xml:space="preserve">Platzer 2019</w:t>
             </w:r>
           </w:p>
         </w:tc>
@@ -1902,32 +1487,7 @@
                 <w:rFonts w:ascii="Calibri" w:hAnsi="Calibri"/>
                 <w:sz w:val="20"/>
               </w:rPr>
-              <w:t xml:space="default"/>
-            </w:r>
-          </w:p>
-        </w:tc>
-        <w:tc>
-          <w:tcPr>
-            <w:tcBorders>
-              <w:top w:val="single" w:space="0" w:color="D3D3D3"/>
-              <w:bottom w:val="single" w:space="0" w:color="D3D3D3"/>
-              <w:start w:val="single" w:space="0" w:color="D3D3D3"/>
-              <w:end w:val="single" w:space="0" w:color="D3D3D3"/>
-            </w:tcBorders>
-            <w:shd w:val="clear" w:color="auto" w:fill="F2F2F2"/>
-          </w:tcPr>
-          <w:p>
-            <w:pPr>
-              <w:spacing w:before="0" w:after="60"/>
-              <w:keepNext/>
-              <w:jc w:val="center"/>
-            </w:pPr>
-            <w:r>
-              <w:rPr>
-                <w:rFonts w:ascii="Calibri" w:hAnsi="Calibri"/>
-                <w:sz w:val="20"/>
-              </w:rPr>
-              <w:t xml:space="preserve">What drugs may impact conditions related to inborn disorder of neurotransmitter metabolism and transport</w:t>
+              <w:t xml:space="preserve">Choudhary 2017</w:t>
             </w:r>
           </w:p>
         </w:tc>
@@ -2007,31 +1567,7 @@
                 <w:rFonts w:ascii="Calibri" w:hAnsi="Calibri"/>
                 <w:sz w:val="20"/>
               </w:rPr>
-              <w:t xml:space="default"/>
-            </w:r>
-          </w:p>
-        </w:tc>
-        <w:tc>
-          <w:tcPr>
-            <w:tcBorders>
-              <w:top w:val="single" w:space="0" w:color="D3D3D3"/>
-              <w:bottom w:val="single" w:space="0" w:color="D3D3D3"/>
-              <w:start w:val="single" w:space="0" w:color="D3D3D3"/>
-              <w:end w:val="single" w:space="0" w:color="D3D3D3"/>
-            </w:tcBorders>
-          </w:tcPr>
-          <w:p>
-            <w:pPr>
-              <w:spacing w:before="0" w:after="60"/>
-              <w:keepNext/>
-              <w:jc w:val="center"/>
-            </w:pPr>
-            <w:r>
-              <w:rPr>
-                <w:rFonts w:ascii="Calibri" w:hAnsi="Calibri"/>
-                <w:sz w:val="20"/>
-              </w:rPr>
-              <w:t xml:space="preserve">What drugs may impact conditions related to neurodegenerative disease</w:t>
+              <w:t xml:space="preserve">Sato 2015</w:t>
             </w:r>
           </w:p>
         </w:tc>
@@ -2111,32 +1647,7 @@
                 <w:rFonts w:ascii="Calibri" w:hAnsi="Calibri"/>
                 <w:sz w:val="20"/>
               </w:rPr>
-              <w:t xml:space="default"/>
-            </w:r>
-          </w:p>
-        </w:tc>
-        <w:tc>
-          <w:tcPr>
-            <w:tcBorders>
-              <w:top w:val="single" w:space="0" w:color="D3D3D3"/>
-              <w:bottom w:val="single" w:space="0" w:color="D3D3D3"/>
-              <w:start w:val="single" w:space="0" w:color="D3D3D3"/>
-              <w:end w:val="single" w:space="0" w:color="D3D3D3"/>
-            </w:tcBorders>
-            <w:shd w:val="clear" w:color="auto" w:fill="F2F2F2"/>
-          </w:tcPr>
-          <w:p>
-            <w:pPr>
-              <w:spacing w:before="0" w:after="60"/>
-              <w:keepNext/>
-              <w:jc w:val="center"/>
-            </w:pPr>
-            <w:r>
-              <w:rPr>
-                <w:rFonts w:ascii="Calibri" w:hAnsi="Calibri"/>
-                <w:sz w:val="20"/>
-              </w:rPr>
-              <w:t xml:space="preserve">What drugs may impact conditions related to axonal neuropathy</w:t>
+              <w:t xml:space="preserve">Iwasawa 2019</w:t>
             </w:r>
           </w:p>
         </w:tc>
@@ -2181,7 +1692,7 @@
             <w:tcMar>
               <w:top w:w="25" w:type="dxa"/>
             </w:tcMar>
-            <w:gridSpan w:val="4"/>
+            <w:gridSpan w:val="3"/>
           </w:tcPr>
           <w:p>
             <w:pPr>
@@ -2249,31 +1760,7 @@
                 <w:rFonts w:ascii="Calibri" w:hAnsi="Calibri"/>
                 <w:sz w:val="20"/>
               </w:rPr>
-              <w:t xml:space="preserve">JIP4</w:t>
-            </w:r>
-          </w:p>
-        </w:tc>
-        <w:tc>
-          <w:tcPr>
-            <w:tcBorders>
-              <w:top w:val="single" w:space="0" w:color="D3D3D3"/>
-              <w:bottom w:val="single" w:space="0" w:color="D3D3D3"/>
-              <w:start w:val="single" w:space="0" w:color="D3D3D3"/>
-              <w:end w:val="single" w:space="0" w:color="D3D3D3"/>
-            </w:tcBorders>
-          </w:tcPr>
-          <w:p>
-            <w:pPr>
-              <w:spacing w:before="0" w:after="60"/>
-              <w:keepNext/>
-              <w:jc w:val="center"/>
-            </w:pPr>
-            <w:r>
-              <w:rPr>
-                <w:rFonts w:ascii="Calibri" w:hAnsi="Calibri"/>
-                <w:sz w:val="20"/>
-              </w:rPr>
-              <w:t xml:space="preserve">What chemicals may increase the activity of SPAG9</w:t>
+              <w:t xml:space="preserve">Gowrishankar 2021</w:t>
             </w:r>
           </w:p>
         </w:tc>
@@ -2353,32 +1840,7 @@
                 <w:rFonts w:ascii="Calibri" w:hAnsi="Calibri"/>
                 <w:sz w:val="20"/>
               </w:rPr>
-              <w:t xml:space="preserve">kinase related to parkinsons</w:t>
-            </w:r>
-          </w:p>
-        </w:tc>
-        <w:tc>
-          <w:tcPr>
-            <w:tcBorders>
-              <w:top w:val="single" w:space="0" w:color="D3D3D3"/>
-              <w:bottom w:val="single" w:space="0" w:color="D3D3D3"/>
-              <w:start w:val="single" w:space="0" w:color="D3D3D3"/>
-              <w:end w:val="single" w:space="0" w:color="D3D3D3"/>
-            </w:tcBorders>
-            <w:shd w:val="clear" w:color="auto" w:fill="F2F2F2"/>
-          </w:tcPr>
-          <w:p>
-            <w:pPr>
-              <w:spacing w:before="0" w:after="60"/>
-              <w:keepNext/>
-              <w:jc w:val="center"/>
-            </w:pPr>
-            <w:r>
-              <w:rPr>
-                <w:rFonts w:ascii="Calibri" w:hAnsi="Calibri"/>
-                <w:sz w:val="20"/>
-              </w:rPr>
-              <w:t xml:space="preserve">What chemicals may decrease the activity of LRRK2</w:t>
+              <w:t xml:space="preserve">Gowrishankar 2021</w:t>
             </w:r>
           </w:p>
         </w:tc>
@@ -2458,31 +1920,7 @@
                 <w:rFonts w:ascii="Calibri" w:hAnsi="Calibri"/>
                 <w:sz w:val="20"/>
               </w:rPr>
-              <w:t xml:space="default"/>
-            </w:r>
-          </w:p>
-        </w:tc>
-        <w:tc>
-          <w:tcPr>
-            <w:tcBorders>
-              <w:top w:val="single" w:space="0" w:color="D3D3D3"/>
-              <w:bottom w:val="single" w:space="0" w:color="D3D3D3"/>
-              <w:start w:val="single" w:space="0" w:color="D3D3D3"/>
-              <w:end w:val="single" w:space="0" w:color="D3D3D3"/>
-            </w:tcBorders>
-          </w:tcPr>
-          <w:p>
-            <w:pPr>
-              <w:spacing w:before="0" w:after="60"/>
-              <w:keepNext/>
-              <w:jc w:val="center"/>
-            </w:pPr>
-            <w:r>
-              <w:rPr>
-                <w:rFonts w:ascii="Calibri" w:hAnsi="Calibri"/>
-                <w:sz w:val="20"/>
-              </w:rPr>
-              <w:t xml:space="preserve">What chemicals may decrease the activity of CDK5</w:t>
+              <w:t xml:space="preserve">Klinman 2015</w:t>
             </w:r>
           </w:p>
         </w:tc>
@@ -2562,32 +2000,7 @@
                 <w:rFonts w:ascii="Calibri" w:hAnsi="Calibri"/>
                 <w:sz w:val="20"/>
               </w:rPr>
-              <w:t xml:space="preserve">paper that shows direct protein interaction with JIP3</w:t>
-            </w:r>
-          </w:p>
-        </w:tc>
-        <w:tc>
-          <w:tcPr>
-            <w:tcBorders>
-              <w:top w:val="single" w:space="0" w:color="D3D3D3"/>
-              <w:bottom w:val="single" w:space="0" w:color="D3D3D3"/>
-              <w:start w:val="single" w:space="0" w:color="D3D3D3"/>
-              <w:end w:val="single" w:space="0" w:color="D3D3D3"/>
-            </w:tcBorders>
-            <w:shd w:val="clear" w:color="auto" w:fill="F2F2F2"/>
-          </w:tcPr>
-          <w:p>
-            <w:pPr>
-              <w:spacing w:before="0" w:after="60"/>
-              <w:keepNext/>
-              <w:jc w:val="center"/>
-            </w:pPr>
-            <w:r>
-              <w:rPr>
-                <w:rFonts w:ascii="Calibri" w:hAnsi="Calibri"/>
-                <w:sz w:val="20"/>
-              </w:rPr>
-              <w:t xml:space="preserve">What chemicals may increase the activity of ARF6</w:t>
+              <w:t xml:space="preserve">Montagnac 2009</w:t>
             </w:r>
           </w:p>
         </w:tc>
@@ -2667,31 +2080,7 @@
                 <w:rFonts w:ascii="Calibri" w:hAnsi="Calibri"/>
                 <w:sz w:val="20"/>
               </w:rPr>
-              <w:t xml:space="preserve">receptor for BDNF</w:t>
-            </w:r>
-          </w:p>
-        </w:tc>
-        <w:tc>
-          <w:tcPr>
-            <w:tcBorders>
-              <w:top w:val="single" w:space="0" w:color="D3D3D3"/>
-              <w:bottom w:val="single" w:space="0" w:color="D3D3D3"/>
-              <w:start w:val="single" w:space="0" w:color="D3D3D3"/>
-              <w:end w:val="single" w:space="0" w:color="D3D3D3"/>
-            </w:tcBorders>
-          </w:tcPr>
-          <w:p>
-            <w:pPr>
-              <w:spacing w:before="0" w:after="60"/>
-              <w:keepNext/>
-              <w:jc w:val="center"/>
-            </w:pPr>
-            <w:r>
-              <w:rPr>
-                <w:rFonts w:ascii="Calibri" w:hAnsi="Calibri"/>
-                <w:sz w:val="20"/>
-              </w:rPr>
-              <w:t xml:space="preserve">What chemicals may decrease the activity of MTOR</w:t>
+              <w:t xml:space="preserve">Moya-Alvarado 2023</w:t>
             </w:r>
           </w:p>
         </w:tc>
@@ -2771,32 +2160,7 @@
                 <w:rFonts w:ascii="Calibri" w:hAnsi="Calibri"/>
                 <w:sz w:val="20"/>
               </w:rPr>
-              <w:t xml:space="preserve">receptor for BDNF</w:t>
-            </w:r>
-          </w:p>
-        </w:tc>
-        <w:tc>
-          <w:tcPr>
-            <w:tcBorders>
-              <w:top w:val="single" w:space="0" w:color="D3D3D3"/>
-              <w:bottom w:val="single" w:space="0" w:color="D3D3D3"/>
-              <w:start w:val="single" w:space="0" w:color="D3D3D3"/>
-              <w:end w:val="single" w:space="0" w:color="D3D3D3"/>
-            </w:tcBorders>
-            <w:shd w:val="clear" w:color="auto" w:fill="F2F2F2"/>
-          </w:tcPr>
-          <w:p>
-            <w:pPr>
-              <w:spacing w:before="0" w:after="60"/>
-              <w:keepNext/>
-              <w:jc w:val="center"/>
-            </w:pPr>
-            <w:r>
-              <w:rPr>
-                <w:rFonts w:ascii="Calibri" w:hAnsi="Calibri"/>
-                <w:sz w:val="20"/>
-              </w:rPr>
-              <w:t xml:space="preserve">What chemicals may increase the activity of NTRK2</w:t>
+              <w:t xml:space="preserve">Huang 2011</w:t>
             </w:r>
           </w:p>
         </w:tc>
@@ -2876,31 +2240,7 @@
                 <w:rFonts w:ascii="Calibri" w:hAnsi="Calibri"/>
                 <w:sz w:val="20"/>
               </w:rPr>
-              <w:t xml:space="default"/>
-            </w:r>
-          </w:p>
-        </w:tc>
-        <w:tc>
-          <w:tcPr>
-            <w:tcBorders>
-              <w:top w:val="single" w:space="0" w:color="D3D3D3"/>
-              <w:bottom w:val="single" w:space="0" w:color="D3D3D3"/>
-              <w:start w:val="single" w:space="0" w:color="D3D3D3"/>
-              <w:end w:val="single" w:space="0" w:color="D3D3D3"/>
-            </w:tcBorders>
-          </w:tcPr>
-          <w:p>
-            <w:pPr>
-              <w:spacing w:before="0" w:after="60"/>
-              <w:keepNext/>
-              <w:jc w:val="center"/>
-            </w:pPr>
-            <w:r>
-              <w:rPr>
-                <w:rFonts w:ascii="Calibri" w:hAnsi="Calibri"/>
-                <w:sz w:val="20"/>
-              </w:rPr>
-              <w:t xml:space="preserve">What chemicals may increase the activity of DRD1</w:t>
+              <w:t xml:space="preserve">Zhang 2025</w:t>
             </w:r>
           </w:p>
         </w:tc>
@@ -2980,32 +2320,7 @@
                 <w:rFonts w:ascii="Calibri" w:hAnsi="Calibri"/>
                 <w:sz w:val="20"/>
               </w:rPr>
-              <w:t xml:space="default"/>
-            </w:r>
-          </w:p>
-        </w:tc>
-        <w:tc>
-          <w:tcPr>
-            <w:tcBorders>
-              <w:top w:val="single" w:space="0" w:color="D3D3D3"/>
-              <w:bottom w:val="single" w:space="0" w:color="D3D3D3"/>
-              <w:start w:val="single" w:space="0" w:color="D3D3D3"/>
-              <w:end w:val="single" w:space="0" w:color="D3D3D3"/>
-            </w:tcBorders>
-            <w:shd w:val="clear" w:color="auto" w:fill="F2F2F2"/>
-          </w:tcPr>
-          <w:p>
-            <w:pPr>
-              <w:spacing w:before="0" w:after="60"/>
-              <w:keepNext/>
-              <w:jc w:val="center"/>
-            </w:pPr>
-            <w:r>
-              <w:rPr>
-                <w:rFonts w:ascii="Calibri" w:hAnsi="Calibri"/>
-                <w:sz w:val="20"/>
-              </w:rPr>
-              <w:t xml:space="preserve">What chemicals may increase the activity of DRD2</w:t>
+              <w:t xml:space="preserve">Zhang 2025</w:t>
             </w:r>
           </w:p>
         </w:tc>
@@ -3085,31 +2400,7 @@
                 <w:rFonts w:ascii="Calibri" w:hAnsi="Calibri"/>
                 <w:sz w:val="20"/>
               </w:rPr>
-              <w:t xml:space="default"/>
-            </w:r>
-          </w:p>
-        </w:tc>
-        <w:tc>
-          <w:tcPr>
-            <w:tcBorders>
-              <w:top w:val="single" w:space="0" w:color="D3D3D3"/>
-              <w:bottom w:val="single" w:space="0" w:color="D3D3D3"/>
-              <w:start w:val="single" w:space="0" w:color="D3D3D3"/>
-              <w:end w:val="single" w:space="0" w:color="D3D3D3"/>
-            </w:tcBorders>
-          </w:tcPr>
-          <w:p>
-            <w:pPr>
-              <w:spacing w:before="0" w:after="60"/>
-              <w:keepNext/>
-              <w:jc w:val="center"/>
-            </w:pPr>
-            <w:r>
-              <w:rPr>
-                <w:rFonts w:ascii="Calibri" w:hAnsi="Calibri"/>
-                <w:sz w:val="20"/>
-              </w:rPr>
-              <w:t xml:space="preserve">What chemicals may decrease the activity of MAPK8</w:t>
+              <w:t xml:space="preserve">Drerup 2013</w:t>
             </w:r>
           </w:p>
         </w:tc>
@@ -3265,10 +2556,10 @@
   <w:docDefaults>
     <w:rPrDefault>
       <w:rPr>
-        <w:rFonts w:asciiTheme="minorHAnsi" w:cstheme="minorBidi" w:eastAsiaTheme="minorEastAsia" w:hAnsiTheme="minorHAnsi"/>
+        <w:rFonts w:asciiTheme="minorHAnsi" w:cstheme="minorBidi" w:eastAsiaTheme="minorHAnsi" w:hAnsiTheme="minorHAnsi"/>
         <w:sz w:val="24"/>
         <w:szCs w:val="24"/>
-        <w:lang w:bidi="ar-SA" w:eastAsia="zh-CN" w:val="en-US"/>
+        <w:lang w:bidi="ar-SA" w:eastAsia="en-US" w:val="en-US"/>
       </w:rPr>
     </w:rPrDefault>
     <w:pPrDefault>
@@ -3809,6 +3100,13 @@
       </w:tblCellMar>
     </w:tblPr>
     <w:tblStylePr w:type="firstRow">
+      <w:tblPr>
+        <w:jc w:val="left"/>
+        <w:tblInd w:type="dxa" w:w="0"/>
+      </w:tblPr>
+      <w:trPr>
+        <w:jc w:val="left"/>
+      </w:trPr>
       <w:tcPr>
         <w:tcBorders>
           <w:bottom w:val="single"/>

</xml_diff>